<commit_message>
created first textblock for welcome message
</commit_message>
<xml_diff>
--- a/PasswordGeneratorWPF/Passwordgenerator_WPF_notizen.docx
+++ b/PasswordGeneratorWPF/Passwordgenerator_WPF_notizen.docx
@@ -606,6 +606,7 @@
       </w:pPr>
       <w:r>
         <w:rPr>
+          <w:noProof/>
           <w:lang w:val="de-DE"/>
         </w:rPr>
         <w:drawing>
@@ -653,6 +654,7 @@
       </w:pPr>
       <w:r>
         <w:rPr>
+          <w:noProof/>
           <w:lang w:val="de-DE"/>
         </w:rPr>
         <w:drawing>
@@ -741,6 +743,7 @@
       </w:pPr>
       <w:r>
         <w:rPr>
+          <w:noProof/>
           <w:lang w:val="de-DE"/>
         </w:rPr>
         <w:drawing>
@@ -936,11 +939,6 @@
       </w:r>
     </w:p>
     <w:p>
-      <w:pPr>
-        <w:rPr>
-          <w:lang w:val="de-DE"/>
-        </w:rPr>
-      </w:pPr>
       <w:r>
         <w:t xml:space="preserve">Ein </w:t>
       </w:r>
@@ -954,6 +952,61 @@
       <w:r>
         <w:t xml:space="preserve"> ist einfach ein Button, mit dem man einen Text (z. B. das generierte Passwort) direkt in die Zwischenablage kopieren kann. So muss man es nicht manuell markieren und kopieren</w:t>
       </w:r>
+    </w:p>
+    <w:p>
+      <w:pPr>
+        <w:rPr>
+          <w:lang w:val="de-DE"/>
+        </w:rPr>
+      </w:pPr>
+      <w:r>
+        <w:rPr>
+          <w:lang w:val="de-DE"/>
+        </w:rPr>
+        <w:lastRenderedPageBreak/>
+        <w:drawing>
+          <wp:inline distT="0" distB="0" distL="0" distR="0" wp14:anchorId="64D54119" wp14:editId="5B67D771">
+            <wp:extent cx="5760720" cy="6661785"/>
+            <wp:effectExtent l="0" t="0" r="0" b="5715"/>
+            <wp:docPr id="871410540" name="Grafik 1" descr="Ein Bild, das Text, Screenshot, Software, Computer enthält.&#10;&#10;KI-generierte Inhalte können fehlerhaft sein."/>
+            <wp:cNvGraphicFramePr>
+              <a:graphicFrameLocks xmlns:a="http://schemas.openxmlformats.org/drawingml/2006/main" noChangeAspect="1"/>
+            </wp:cNvGraphicFramePr>
+            <a:graphic xmlns:a="http://schemas.openxmlformats.org/drawingml/2006/main">
+              <a:graphicData uri="http://schemas.openxmlformats.org/drawingml/2006/picture">
+                <pic:pic xmlns:pic="http://schemas.openxmlformats.org/drawingml/2006/picture">
+                  <pic:nvPicPr>
+                    <pic:cNvPr id="871410540" name="Grafik 1" descr="Ein Bild, das Text, Screenshot, Software, Computer enthält.&#10;&#10;KI-generierte Inhalte können fehlerhaft sein."/>
+                    <pic:cNvPicPr/>
+                  </pic:nvPicPr>
+                  <pic:blipFill>
+                    <a:blip r:embed="rId11"/>
+                    <a:stretch>
+                      <a:fillRect/>
+                    </a:stretch>
+                  </pic:blipFill>
+                  <pic:spPr>
+                    <a:xfrm>
+                      <a:off x="0" y="0"/>
+                      <a:ext cx="5760720" cy="6661785"/>
+                    </a:xfrm>
+                    <a:prstGeom prst="rect">
+                      <a:avLst/>
+                    </a:prstGeom>
+                  </pic:spPr>
+                </pic:pic>
+              </a:graphicData>
+            </a:graphic>
+          </wp:inline>
+        </w:drawing>
+      </w:r>
+    </w:p>
+    <w:p>
+      <w:pPr>
+        <w:rPr>
+          <w:lang w:val="de-DE"/>
+        </w:rPr>
+      </w:pPr>
     </w:p>
     <w:sectPr>
       <w:pgSz w:w="11906" w:h="16838"/>
@@ -1665,6 +1718,7 @@
   <w:style w:type="character" w:default="1" w:styleId="Absatz-Standardschriftart">
     <w:name w:val="Default Paragraph Font"/>
     <w:uiPriority w:val="1"/>
+    <w:semiHidden/>
     <w:unhideWhenUsed/>
   </w:style>
   <w:style w:type="table" w:default="1" w:styleId="NormaleTabelle">
@@ -2277,20 +2331,20 @@
 </file>
 
 <file path=customXml/item1.xml><?xml version="1.0" encoding="utf-8"?>
-<p:properties xmlns:p="http://schemas.microsoft.com/office/2006/metadata/properties" xmlns:xsi="http://www.w3.org/2001/XMLSchema-instance" xmlns:pc="http://schemas.microsoft.com/office/infopath/2007/PartnerControls">
-  <documentManagement>
-    <_activity xmlns="bc4f6783-5713-438e-8140-5a6a08f337a4" xsi:nil="true"/>
-  </documentManagement>
-</p:properties>
-</file>
-
-<file path=customXml/item2.xml><?xml version="1.0" encoding="utf-8"?>
 <?mso-contentType ?>
 <FormTemplates xmlns="http://schemas.microsoft.com/sharepoint/v3/contenttype/forms">
   <Display>DocumentLibraryForm</Display>
   <Edit>DocumentLibraryForm</Edit>
   <New>DocumentLibraryForm</New>
 </FormTemplates>
+</file>
+
+<file path=customXml/item2.xml><?xml version="1.0" encoding="utf-8"?>
+<p:properties xmlns:p="http://schemas.microsoft.com/office/2006/metadata/properties" xmlns:xsi="http://www.w3.org/2001/XMLSchema-instance" xmlns:pc="http://schemas.microsoft.com/office/infopath/2007/PartnerControls">
+  <documentManagement>
+    <_activity xmlns="bc4f6783-5713-438e-8140-5a6a08f337a4" xsi:nil="true"/>
+  </documentManagement>
+</p:properties>
 </file>
 
 <file path=customXml/item3.xml><?xml version="1.0" encoding="utf-8"?>
@@ -2476,19 +2530,19 @@
 </file>
 
 <file path=customXml/itemProps1.xml><?xml version="1.0" encoding="utf-8"?>
+<ds:datastoreItem xmlns:ds="http://schemas.openxmlformats.org/officeDocument/2006/customXml" ds:itemID="{AA635F0D-BE8E-4D3A-A3C6-8A4441A1DE62}">
+  <ds:schemaRefs>
+    <ds:schemaRef ds:uri="http://schemas.microsoft.com/sharepoint/v3/contenttype/forms"/>
+  </ds:schemaRefs>
+</ds:datastoreItem>
+</file>
+
+<file path=customXml/itemProps2.xml><?xml version="1.0" encoding="utf-8"?>
 <ds:datastoreItem xmlns:ds="http://schemas.openxmlformats.org/officeDocument/2006/customXml" ds:itemID="{FBF7FE71-0D26-4678-A4E5-D2364280A39C}">
   <ds:schemaRefs>
     <ds:schemaRef ds:uri="http://schemas.microsoft.com/office/2006/metadata/properties"/>
     <ds:schemaRef ds:uri="http://schemas.microsoft.com/office/infopath/2007/PartnerControls"/>
     <ds:schemaRef ds:uri="bc4f6783-5713-438e-8140-5a6a08f337a4"/>
-  </ds:schemaRefs>
-</ds:datastoreItem>
-</file>
-
-<file path=customXml/itemProps2.xml><?xml version="1.0" encoding="utf-8"?>
-<ds:datastoreItem xmlns:ds="http://schemas.openxmlformats.org/officeDocument/2006/customXml" ds:itemID="{AA635F0D-BE8E-4D3A-A3C6-8A4441A1DE62}">
-  <ds:schemaRefs>
-    <ds:schemaRef ds:uri="http://schemas.microsoft.com/sharepoint/v3/contenttype/forms"/>
   </ds:schemaRefs>
 </ds:datastoreItem>
 </file>

</xml_diff>